<commit_message>
Add separate statement of significance upload file
</commit_message>
<xml_diff>
--- a/Submission package/submission_checklist_jbi.docx
+++ b/Submission package/submission_checklist_jbi.docx
@@ -162,6 +162,27 @@
           <w:rStyle w:val="VerbatimChar"/>
         </w:rPr>
         <w:t xml:space="preserve">declarations.docx</w:t>
+      </w:r>
+    </w:p>
+    <w:p>
+      <w:pPr>
+        <w:pStyle w:val="Compact"/>
+        <w:numPr>
+          <w:ilvl w:val="0"/>
+          <w:numId w:val="1001"/>
+        </w:numPr>
+      </w:pPr>
+      <w:r>
+        <w:t xml:space="preserve">Statement of Significance, if the system requests it as a separate upload:</w:t>
+      </w:r>
+      <w:r>
+        <w:t xml:space="preserve"> </w:t>
+      </w:r>
+      <w:r>
+        <w:rPr>
+          <w:rStyle w:val="VerbatimChar"/>
+        </w:rPr>
+        <w:t xml:space="preserve">statement_of_significance.docx</w:t>
       </w:r>
     </w:p>
     <w:p>

</xml_diff>